<commit_message>
Push abdomen-pelvis updates with SVG, HTML, and flashcard improvements
</commit_message>
<xml_diff>
--- a/www/content/abdomen-pelvis/Deep perineal pouch and urogenital diaphragm.docx
+++ b/www/content/abdomen-pelvis/Deep perineal pouch and urogenital diaphragm.docx
@@ -28,15 +28,7 @@
     </w:p>
     <w:p>
       <w:r>
-        <w:t xml:space="preserve">It is an </w:t>
-      </w:r>
-      <w:proofErr w:type="spellStart"/>
-      <w:r>
-        <w:t>interfascial</w:t>
-      </w:r>
-      <w:proofErr w:type="spellEnd"/>
-      <w:r>
-        <w:t xml:space="preserve"> space across the pubic arch &amp; above the perineal membrane.</w:t>
+        <w:t>It is an interfascial space across the pubic arch &amp; above the perineal membrane.</w:t>
       </w:r>
     </w:p>
     <w:p>
@@ -63,15 +55,8 @@
       </w:r>
     </w:p>
     <w:p>
-      <w:proofErr w:type="spellStart"/>
-      <w:proofErr w:type="gramStart"/>
-      <w:r>
-        <w:t>Below:perineal</w:t>
-      </w:r>
-      <w:proofErr w:type="spellEnd"/>
-      <w:proofErr w:type="gramEnd"/>
-      <w:r>
-        <w:t xml:space="preserve"> membrane.</w:t>
+      <w:r>
+        <w:t>Below:perineal membrane.</w:t>
       </w:r>
     </w:p>
     <w:p>
@@ -144,13 +129,23 @@
         </w:drawing>
       </w:r>
     </w:p>
+    <w:p>
+      <w:r>
+        <w:t>[YOUTUBE]</w:t>
+      </w:r>
+      <w:r>
+        <w:t xml:space="preserve"> </w:t>
+      </w:r>
+      <w:r>
+        <w:t>https://youtu.be/nnMnXsKk8uY</w:t>
+      </w:r>
+    </w:p>
     <w:p/>
     <w:p>
       <w:pPr>
         <w:pStyle w:val="Heading2"/>
       </w:pPr>
       <w:r>
-        <w:lastRenderedPageBreak/>
         <w:t xml:space="preserve">Contents </w:t>
       </w:r>
       <w:r>
@@ -181,13 +176,8 @@
         </w:numPr>
       </w:pPr>
       <w:r>
-        <w:t xml:space="preserve">Deep transverse </w:t>
-      </w:r>
-      <w:proofErr w:type="spellStart"/>
-      <w:r>
-        <w:t>perenei</w:t>
-      </w:r>
-      <w:proofErr w:type="spellEnd"/>
+        <w:t>Deep transverse perenei</w:t>
+      </w:r>
     </w:p>
     <w:p>
       <w:pPr>
@@ -210,15 +200,7 @@
         </w:numPr>
       </w:pPr>
       <w:r>
-        <w:t xml:space="preserve">Sphincter </w:t>
-      </w:r>
-      <w:proofErr w:type="spellStart"/>
-      <w:r>
-        <w:t>urethrovaginalis</w:t>
-      </w:r>
-      <w:proofErr w:type="spellEnd"/>
-      <w:r>
-        <w:t>(F) (muscular branches of perineal nerve)</w:t>
+        <w:t>Sphincter urethrovaginalis(F) (muscular branches of perineal nerve)</w:t>
       </w:r>
     </w:p>
     <w:p>
@@ -344,7 +326,7 @@
         </w:rPr>
         <w:lastRenderedPageBreak/>
         <w:drawing>
-          <wp:inline distT="0" distB="0" distL="0" distR="0" wp14:anchorId="1E725961" wp14:editId="26133DAF">
+          <wp:inline distT="0" distB="0" distL="0" distR="0" wp14:anchorId="1E725961" wp14:editId="5D1E0126">
             <wp:extent cx="5731510" cy="4730750"/>
             <wp:effectExtent l="0" t="0" r="0" b="0"/>
             <wp:docPr id="132349908" name="Picture 2" descr="Background image"/>
@@ -403,13 +385,7 @@
     </w:p>
     <w:p>
       <w:r>
-        <w:t xml:space="preserve">It is a </w:t>
-      </w:r>
-      <w:r>
-        <w:t>Musculo</w:t>
-      </w:r>
-      <w:r>
-        <w:t>-fascial partition across the pubic arch separating the pelvic cavity from the anterior part of the pelvic outlet.</w:t>
+        <w:t>It is a Musculo-fascial partition across the pubic arch separating the pelvic cavity from the anterior part of the pelvic outlet.</w:t>
       </w:r>
     </w:p>
     <w:p>
@@ -463,15 +439,7 @@
     </w:p>
     <w:p>
       <w:r>
-        <w:t xml:space="preserve">Urogenital </w:t>
-      </w:r>
-      <w:proofErr w:type="spellStart"/>
-      <w:r>
-        <w:t>diaphragmIt</w:t>
-      </w:r>
-      <w:proofErr w:type="spellEnd"/>
-      <w:r>
-        <w:t xml:space="preserve"> is pierced by</w:t>
+        <w:t>Urogenital diaphragmIt is pierced by</w:t>
       </w:r>
     </w:p>
     <w:p>
@@ -528,15 +496,7 @@
         </w:numPr>
       </w:pPr>
       <w:r>
-        <w:t xml:space="preserve">Anterior recess of </w:t>
-      </w:r>
-      <w:proofErr w:type="spellStart"/>
-      <w:r>
-        <w:t>ischorectal</w:t>
-      </w:r>
-      <w:proofErr w:type="spellEnd"/>
-      <w:r>
-        <w:t xml:space="preserve"> fossa.</w:t>
+        <w:t>Anterior recess of ischorectal fossa.</w:t>
       </w:r>
     </w:p>
     <w:p>
@@ -730,6 +690,17 @@
             </a:graphic>
           </wp:inline>
         </w:drawing>
+      </w:r>
+    </w:p>
+    <w:p>
+      <w:r>
+        <w:t>[YOUTUBE]</w:t>
+      </w:r>
+      <w:r>
+        <w:t xml:space="preserve"> </w:t>
+      </w:r>
+      <w:r>
+        <w:t>https://youtu.be/U34EGZkft18</w:t>
       </w:r>
     </w:p>
     <w:p/>
@@ -3629,6 +3600,7 @@
   <w:style w:type="character" w:default="1" w:styleId="DefaultParagraphFont">
     <w:name w:val="Default Paragraph Font"/>
     <w:uiPriority w:val="1"/>
+    <w:semiHidden/>
     <w:unhideWhenUsed/>
   </w:style>
   <w:style w:type="table" w:default="1" w:styleId="TableNormal">

</xml_diff>